<commit_message>
Independent Compliance/Alternative on PS1, Site verification field, LBP bullet lists, scope shading fix, LBP page break
- PS1 Input: Compliance and Alternative are now independent checkboxes
  instead of a mutually-exclusive radio pair.
- PS1 Input: new Site verification field, feeds the existing
  {{site_verfication}} template token.
- LBP form's per-item description cells are now real bulleted lists
  (one bullet per line typed); {{scope}} flattens the same lines into
  one combined list instead of one merged line per item.
- Fixed PS1's {{scope}} grey background: removed a fixed-size decorative
  shape that never tracked content height, replaced with real paragraph
  shading that grows with the bullet list (matches LBP's shading color).
- LBP form: "WAIVERS AND MODIFICATIONS" now always starts on a new page.

Co-Authored-By: Claude Sonnet 5 <noreply@anthropic.com>
</commit_message>
<xml_diff>
--- a/resources/templates/LBP form.docx
+++ b/resources/templates/LBP form.docx
@@ -396,7 +396,15 @@
           </w:tcPr>
           <w:p>
             <w:r>
-              <w:t>{{client_info}}</w:t>
+              <w:t>{{</w:t>
+            </w:r>
+            <w:proofErr w:type="spellStart"/>
+            <w:r>
+              <w:t>client_info</w:t>
+            </w:r>
+            <w:proofErr w:type="spellEnd"/>
+            <w:r>
+              <w:t>}}</w:t>
             </w:r>
           </w:p>
         </w:tc>
@@ -652,14 +660,14 @@
         <w:tblLook w:val="04A0" w:firstRow="1" w:lastRow="0" w:firstColumn="1" w:lastColumn="0" w:noHBand="0" w:noVBand="1"/>
       </w:tblPr>
       <w:tblGrid>
-        <w:gridCol w:w="1467"/>
-        <w:gridCol w:w="396"/>
-        <w:gridCol w:w="236"/>
-        <w:gridCol w:w="3615"/>
-        <w:gridCol w:w="237"/>
-        <w:gridCol w:w="1586"/>
-        <w:gridCol w:w="243"/>
-        <w:gridCol w:w="1223"/>
+        <w:gridCol w:w="1073"/>
+        <w:gridCol w:w="355"/>
+        <w:gridCol w:w="221"/>
+        <w:gridCol w:w="2360"/>
+        <w:gridCol w:w="221"/>
+        <w:gridCol w:w="2320"/>
+        <w:gridCol w:w="221"/>
+        <w:gridCol w:w="2255"/>
       </w:tblGrid>
       <w:tr>
         <w:tc>
@@ -916,7 +924,15 @@
               </w:rPr>
             </w:pPr>
             <w:r>
-              <w:t>{{lbp_foundation_description}}</w:t>
+              <w:t>{{</w:t>
+            </w:r>
+            <w:proofErr w:type="spellStart"/>
+            <w:r>
+              <w:t>lbp_foundation_description</w:t>
+            </w:r>
+            <w:proofErr w:type="spellEnd"/>
+            <w:r>
+              <w:t>}}</w:t>
             </w:r>
           </w:p>
         </w:tc>
@@ -954,7 +970,15 @@
               </w:rPr>
             </w:pPr>
             <w:r>
-              <w:t>{{lbp_foundation_carried_by}}</w:t>
+              <w:t>{{</w:t>
+            </w:r>
+            <w:proofErr w:type="spellStart"/>
+            <w:r>
+              <w:t>lbp_foundation_carried_by</w:t>
+            </w:r>
+            <w:proofErr w:type="spellEnd"/>
+            <w:r>
+              <w:t>}}</w:t>
             </w:r>
           </w:p>
         </w:tc>
@@ -992,7 +1016,15 @@
               </w:rPr>
             </w:pPr>
             <w:r>
-              <w:t>{{lbp_foundation_reference}}</w:t>
+              <w:t>{{</w:t>
+            </w:r>
+            <w:proofErr w:type="spellStart"/>
+            <w:r>
+              <w:t>lbp_foundation_reference</w:t>
+            </w:r>
+            <w:proofErr w:type="spellEnd"/>
+            <w:r>
+              <w:t>}}</w:t>
             </w:r>
           </w:p>
         </w:tc>
@@ -1105,7 +1137,15 @@
               </w:rPr>
             </w:pPr>
             <w:r>
-              <w:t>{{lbp_retaining_description}}</w:t>
+              <w:t>{{</w:t>
+            </w:r>
+            <w:proofErr w:type="spellStart"/>
+            <w:r>
+              <w:t>lbp_retaining_description</w:t>
+            </w:r>
+            <w:proofErr w:type="spellEnd"/>
+            <w:r>
+              <w:t>}}</w:t>
             </w:r>
           </w:p>
         </w:tc>
@@ -1143,7 +1183,15 @@
               </w:rPr>
             </w:pPr>
             <w:r>
-              <w:t>{{lbp_retaining_carried_by}}</w:t>
+              <w:t>{{</w:t>
+            </w:r>
+            <w:proofErr w:type="spellStart"/>
+            <w:r>
+              <w:t>lbp_retaining_carried_by</w:t>
+            </w:r>
+            <w:proofErr w:type="spellEnd"/>
+            <w:r>
+              <w:t>}}</w:t>
             </w:r>
           </w:p>
         </w:tc>
@@ -1181,7 +1229,15 @@
               </w:rPr>
             </w:pPr>
             <w:r>
-              <w:t>{{lbp_retaining_reference}}</w:t>
+              <w:t>{{</w:t>
+            </w:r>
+            <w:proofErr w:type="spellStart"/>
+            <w:r>
+              <w:t>lbp_retaining_reference</w:t>
+            </w:r>
+            <w:proofErr w:type="spellEnd"/>
+            <w:r>
+              <w:t>}}</w:t>
             </w:r>
           </w:p>
         </w:tc>
@@ -1294,7 +1350,15 @@
               </w:rPr>
             </w:pPr>
             <w:r>
-              <w:t>{{lbp_beams_description}}</w:t>
+              <w:t>{{</w:t>
+            </w:r>
+            <w:proofErr w:type="spellStart"/>
+            <w:r>
+              <w:t>lbp_beams_description</w:t>
+            </w:r>
+            <w:proofErr w:type="spellEnd"/>
+            <w:r>
+              <w:t>}}</w:t>
             </w:r>
           </w:p>
         </w:tc>
@@ -1332,7 +1396,15 @@
               </w:rPr>
             </w:pPr>
             <w:r>
-              <w:t>{{lbp_beams_carried_by}}</w:t>
+              <w:t>{{</w:t>
+            </w:r>
+            <w:proofErr w:type="spellStart"/>
+            <w:r>
+              <w:t>lbp_beams_carried_by</w:t>
+            </w:r>
+            <w:proofErr w:type="spellEnd"/>
+            <w:r>
+              <w:t>}}</w:t>
             </w:r>
           </w:p>
         </w:tc>
@@ -1370,7 +1442,15 @@
               </w:rPr>
             </w:pPr>
             <w:r>
-              <w:t>{{lbp_beams_reference}}</w:t>
+              <w:t>{{</w:t>
+            </w:r>
+            <w:proofErr w:type="spellStart"/>
+            <w:r>
+              <w:t>lbp_beams_reference</w:t>
+            </w:r>
+            <w:proofErr w:type="spellEnd"/>
+            <w:r>
+              <w:t>}}</w:t>
             </w:r>
           </w:p>
         </w:tc>
@@ -1483,7 +1563,15 @@
               </w:rPr>
             </w:pPr>
             <w:r>
-              <w:t>{{lbp_portal_description}}</w:t>
+              <w:t>{{</w:t>
+            </w:r>
+            <w:proofErr w:type="spellStart"/>
+            <w:r>
+              <w:t>lbp_portal_description</w:t>
+            </w:r>
+            <w:proofErr w:type="spellEnd"/>
+            <w:r>
+              <w:t>}}</w:t>
             </w:r>
           </w:p>
         </w:tc>
@@ -1521,7 +1609,15 @@
               </w:rPr>
             </w:pPr>
             <w:r>
-              <w:t>{{lbp_portal_carried_by}}</w:t>
+              <w:t>{{</w:t>
+            </w:r>
+            <w:proofErr w:type="spellStart"/>
+            <w:r>
+              <w:t>lbp_portal_carried_by</w:t>
+            </w:r>
+            <w:proofErr w:type="spellEnd"/>
+            <w:r>
+              <w:t>}}</w:t>
             </w:r>
           </w:p>
         </w:tc>
@@ -1559,7 +1655,15 @@
               </w:rPr>
             </w:pPr>
             <w:r>
-              <w:t>{{lbp_portal_reference}}</w:t>
+              <w:t>{{</w:t>
+            </w:r>
+            <w:proofErr w:type="spellStart"/>
+            <w:r>
+              <w:t>lbp_portal_reference</w:t>
+            </w:r>
+            <w:proofErr w:type="spellEnd"/>
+            <w:r>
+              <w:t>}}</w:t>
             </w:r>
           </w:p>
         </w:tc>
@@ -1672,7 +1776,15 @@
               </w:rPr>
             </w:pPr>
             <w:r>
-              <w:t>{{lbp_bracing_description}}</w:t>
+              <w:t>{{</w:t>
+            </w:r>
+            <w:proofErr w:type="spellStart"/>
+            <w:r>
+              <w:t>lbp_bracing_description</w:t>
+            </w:r>
+            <w:proofErr w:type="spellEnd"/>
+            <w:r>
+              <w:t>}}</w:t>
             </w:r>
           </w:p>
         </w:tc>
@@ -1710,7 +1822,15 @@
               </w:rPr>
             </w:pPr>
             <w:r>
-              <w:t>{{lbp_bracing_carried_by}}</w:t>
+              <w:t>{{</w:t>
+            </w:r>
+            <w:proofErr w:type="spellStart"/>
+            <w:r>
+              <w:t>lbp_bracing_carried_by</w:t>
+            </w:r>
+            <w:proofErr w:type="spellEnd"/>
+            <w:r>
+              <w:t>}}</w:t>
             </w:r>
           </w:p>
         </w:tc>
@@ -1748,7 +1868,15 @@
               </w:rPr>
             </w:pPr>
             <w:r>
-              <w:t>{{lbp_bracing_reference}}</w:t>
+              <w:t>{{</w:t>
+            </w:r>
+            <w:proofErr w:type="spellStart"/>
+            <w:r>
+              <w:t>lbp_bracing_reference</w:t>
+            </w:r>
+            <w:proofErr w:type="spellEnd"/>
+            <w:r>
+              <w:t>}}</w:t>
             </w:r>
           </w:p>
         </w:tc>
@@ -1861,7 +1989,15 @@
               </w:rPr>
             </w:pPr>
             <w:r>
-              <w:t>{{lbp_others_description}}</w:t>
+              <w:t>{{</w:t>
+            </w:r>
+            <w:proofErr w:type="spellStart"/>
+            <w:r>
+              <w:t>lbp_others_description</w:t>
+            </w:r>
+            <w:proofErr w:type="spellEnd"/>
+            <w:r>
+              <w:t>}}</w:t>
             </w:r>
           </w:p>
         </w:tc>
@@ -1899,7 +2035,15 @@
               </w:rPr>
             </w:pPr>
             <w:r>
-              <w:t>{{lbp_others_carried_by}}</w:t>
+              <w:t>{{</w:t>
+            </w:r>
+            <w:proofErr w:type="spellStart"/>
+            <w:r>
+              <w:t>lbp_others_carried_by</w:t>
+            </w:r>
+            <w:proofErr w:type="spellEnd"/>
+            <w:r>
+              <w:t>}}</w:t>
             </w:r>
           </w:p>
         </w:tc>
@@ -1937,7 +2081,15 @@
               </w:rPr>
             </w:pPr>
             <w:r>
-              <w:t>{{lbp_others_reference}}</w:t>
+              <w:t>{{</w:t>
+            </w:r>
+            <w:proofErr w:type="spellStart"/>
+            <w:r>
+              <w:t>lbp_others_reference</w:t>
+            </w:r>
+            <w:proofErr w:type="spellEnd"/>
+            <w:r>
+              <w:t>}}</w:t>
             </w:r>
           </w:p>
         </w:tc>
@@ -1951,11 +2103,77 @@
           <w:bCs/>
         </w:rPr>
       </w:pPr>
+    </w:p>
+    <w:p>
+      <w:pPr>
+        <w:rPr>
+          <w:b/>
+          <w:bCs/>
+        </w:rPr>
+      </w:pPr>
+    </w:p>
+    <w:p>
+      <w:pPr>
+        <w:rPr>
+          <w:b/>
+          <w:bCs/>
+        </w:rPr>
+      </w:pPr>
+    </w:p>
+    <w:p>
+      <w:pPr>
+        <w:rPr>
+          <w:b/>
+          <w:bCs/>
+        </w:rPr>
+      </w:pPr>
+    </w:p>
+    <w:p>
+      <w:pPr>
+        <w:rPr>
+          <w:b/>
+          <w:bCs/>
+        </w:rPr>
+      </w:pPr>
+    </w:p>
+    <w:p>
+      <w:pPr>
+        <w:rPr>
+          <w:b/>
+          <w:bCs/>
+        </w:rPr>
+      </w:pPr>
+    </w:p>
+    <w:p>
+      <w:pPr>
+        <w:rPr>
+          <w:b/>
+          <w:bCs/>
+        </w:rPr>
+      </w:pPr>
+    </w:p>
+    <w:p>
+      <w:pPr>
+        <w:rPr>
+          <w:b/>
+          <w:bCs/>
+        </w:rPr>
+      </w:pPr>
+    </w:p>
+    <w:p>
+      <w:pPr>
+        <w:pageBreakBefore/>
+        <w:rPr>
+          <w:b/>
+          <w:bCs/>
+        </w:rPr>
+      </w:pPr>
       <w:r>
         <w:rPr>
           <w:b/>
           <w:bCs/>
         </w:rPr>
+        <w:lastRenderedPageBreak/>
         <w:t>WAIVERS AND MODIFICATIONS</w:t>
       </w:r>
     </w:p>
@@ -2238,7 +2456,15 @@
               </w:rPr>
             </w:pPr>
             <w:r>
-              <w:t>{{lbp_building_code_clause}}</w:t>
+              <w:t>{{</w:t>
+            </w:r>
+            <w:proofErr w:type="spellStart"/>
+            <w:r>
+              <w:t>lbp_building_code_clause</w:t>
+            </w:r>
+            <w:proofErr w:type="spellEnd"/>
+            <w:r>
+              <w:t>}}</w:t>
             </w:r>
           </w:p>
         </w:tc>
@@ -2277,7 +2503,15 @@
               </w:rPr>
             </w:pPr>
             <w:r>
-              <w:t>{{lbp_waiver_modification}}</w:t>
+              <w:t>{{</w:t>
+            </w:r>
+            <w:proofErr w:type="spellStart"/>
+            <w:r>
+              <w:t>lbp_waiver_modification</w:t>
+            </w:r>
+            <w:proofErr w:type="spellEnd"/>
+            <w:r>
+              <w:t>}}</w:t>
             </w:r>
           </w:p>
         </w:tc>
@@ -3180,7 +3414,6 @@
     <w:p/>
     <w:p>
       <w:r>
-        <w:lastRenderedPageBreak/>
         <w:t>DECLARATION</w:t>
       </w:r>
     </w:p>
@@ -3398,6 +3631,7 @@
               </w:rPr>
               <w:t xml:space="preserve">ON BEHALF OF </w:t>
             </w:r>
+            <w:proofErr w:type="spellStart"/>
             <w:r>
               <w:rPr>
                 <w:sz w:val="18"/>
@@ -3406,6 +3640,7 @@
               </w:rPr>
               <w:t>Engsolution</w:t>
             </w:r>
+            <w:proofErr w:type="spellEnd"/>
           </w:p>
         </w:tc>
         <w:tc>

</xml_diff>